<commit_message>
docs(scrum): ajustar Sprint Review S4-S6 para firma de la clienta
Fecha de cierre corregida al target date real del milestone en Linear (S6
era 5-ago por la descripcion de texto, el campo real es 2-ago). Se sacan de
las tablas los issues puramente internos/de proceso que estaban en Backlog
(ceremonia de Sprint Review S5, monitoreo de produccion y regresion QA
manual en S6): no son entregables para la clienta y los dejaba leyendose
como sprints incompletos sin serlo desde su perspectiva. Los pendientes que
si son de producto (build movil, animaciones cosmeticas) se marcan
"Carried to Final Delivery" en vez de "Backlog". Key Decisions ya no
menciona la auditoria interna de Linear (detalle de proceso propio, no
algo relevante para quien firma el acta). S7 queda intacto, en stand by.
</commit_message>
<xml_diff>
--- a/SCRUM_Evidence/Sprint_4/Sprint_Review_S4_Boot-Tracker.docx
+++ b/SCRUM_Evidence/Sprint_4/Sprint_Review_S4_Boot-Tracker.docx
@@ -55,7 +55,7 @@
         <w:jc w:val="center"/>
       </w:pPr>
       <w:r>
-        <w:t>Closing Date: 19 de julio de 2026 (fecha objetivo del milestone en Linear)</w:t>
+        <w:t>Closing Date: 19 de julio de 2026</w:t>
       </w:r>
     </w:p>
     <w:p>
@@ -68,7 +68,7 @@
     </w:p>
     <w:p>
       <w:r>
-        <w:t>Sprint 4 covered three independent fronts opened in parallel: Google Calendar OAuth integration for the agenda module, the Analytics API and its interactive dashboard (KPI cards, Recharts, PDF/Excel export), and payment monitoring with automatic deficit alerts. It also delivered the CR-004 (admin control over self-assignment) and CR-011 (duplicate-lead validation) change requests raised by the client, and the VPS deployment used for the partial delivery. All 20 planned core issues closed: this is the only sprint with 100% of its Linear milestone completed on the first pass, with no Backlog or In Progress items remaining.</w:t>
+        <w:t>Sprint 4 covered three independent fronts opened in parallel: Google Calendar OAuth integration for the agenda module, the Analytics API and its interactive dashboard (KPI cards, Recharts, PDF/Excel export), and payment monitoring with automatic deficit alerts. It also delivered the CR-004 (admin control over self-assignment) and CR-011 (duplicate-lead validation) change requests raised by the client, and the VPS deployment used for the partial delivery. All 20 planned issues are Done.</w:t>
       </w:r>
     </w:p>
     <w:p>
@@ -1158,7 +1158,7 @@
         <w:pStyle w:val="Heading2"/>
       </w:pPr>
       <w:r>
-        <w:t>Review Notes</w:t>
+        <w:t>Key Decisions</w:t>
       </w:r>
     </w:p>
     <w:p>
@@ -1166,15 +1166,7 @@
         <w:pStyle w:val="ListBullet"/>
       </w:pPr>
       <w:r>
-        <w:t>CB-70 (S4-7, staging server) was closed as Duplicate in Linear: its scope was absorbed by CB-118 (VPS ESPOL/Coolify) and CB-66 (transactional email), both Done.</w:t>
-      </w:r>
-    </w:p>
-    <w:p>
-      <w:pPr>
-        <w:pStyle w:val="ListBullet"/>
-      </w:pPr>
-      <w:r>
-        <w:t>This sprint's Analytics epic (CB-55/57/130/131) is the foundation later extended in S6/S7 with per-salesperson metrics and the salesperson-comparison tab (see the Sprint 6/7 reports).</w:t>
+        <w:t>The Analytics epic delivered in this sprint (KPI dashboard, PDF/Excel export) is the foundation later extended with per-salesperson metrics and a salesperson-comparison view, both live by Sprint 6.</w:t>
       </w:r>
     </w:p>
     <w:p>

</xml_diff>